<commit_message>
docs: extend usage guide with P3 ETH dual-node and P4 tooling chapters
</commit_message>
<xml_diff>
--- a/docs/CoSim-Platform-Usage-Guide.docx
+++ b/docs/CoSim-Platform-Usage-Guide.docx
@@ -40,7 +40,7 @@
           <w:sz w:val="22"/>
           <w:rFonts w:ascii="Microsoft YaHei" w:hAnsi="Microsoft YaHei" w:eastAsia="Microsoft YaHei" w:cs="Microsoft YaHei"/>
         </w:rPr>
-        <w:t>版本：P2（DMA + 中断 + 精确模式）</w:t>
+        <w:t>版本：P3（双节点 ETH 互打 + 链路模型）</w:t>
         <w:br/>
       </w:r>
       <w:r>
@@ -191,6 +191,45 @@
           <w:rFonts w:ascii="Microsoft YaHei" w:hAnsi="Microsoft YaHei" w:eastAsia="Microsoft YaHei" w:cs="Microsoft YaHei"/>
         </w:rPr>
         <w:t>POSIX 共享内存 + Unix Domain Socket 低开销 IPC</w:t>
+      </w:r>
+    </w:p>
+    <w:p>
+      <w:pPr>
+        <w:pStyle w:val="ListBullet"/>
+        <w:spacing w:after="40"/>
+      </w:pPr>
+      <w:r>
+        <w:rPr>
+          <w:sz w:val="21"/>
+          <w:rFonts w:ascii="Microsoft YaHei" w:hAnsi="Microsoft YaHei" w:eastAsia="Microsoft YaHei" w:cs="Microsoft YaHei"/>
+        </w:rPr>
+        <w:t>**双节点以太网互打**（P3）：ETH SHM 帧队列、9KB Jumbo、松耦合时间同步</w:t>
+      </w:r>
+    </w:p>
+    <w:p>
+      <w:pPr>
+        <w:pStyle w:val="ListBullet"/>
+        <w:spacing w:after="40"/>
+      </w:pPr>
+      <w:r>
+        <w:rPr>
+          <w:sz w:val="21"/>
+          <w:rFonts w:ascii="Microsoft YaHei" w:hAnsi="Microsoft YaHei" w:eastAsia="Microsoft YaHei" w:cs="Microsoft YaHei"/>
+        </w:rPr>
+        <w:t>**链路模型**（P3）：丢包率、突发丢包、固定延迟、速率限、流控窗口</w:t>
+      </w:r>
+    </w:p>
+    <w:p>
+      <w:pPr>
+        <w:pStyle w:val="ListBullet"/>
+        <w:spacing w:after="40"/>
+      </w:pPr>
+      <w:r>
+        <w:rPr>
+          <w:sz w:val="21"/>
+          <w:rFonts w:ascii="Microsoft YaHei" w:hAnsi="Microsoft YaHei" w:eastAsia="Microsoft YaHei" w:cs="Microsoft YaHei"/>
+        </w:rPr>
+        <w:t>**调试工具链**（P4）：cosim_cli REPL、trace_analyzer、launch_dual 编排</w:t>
       </w:r>
     </w:p>
     <w:p>
@@ -925,7 +964,7 @@
           <w:sz w:val="21"/>
           <w:rFonts w:ascii="Microsoft YaHei" w:hAnsi="Microsoft YaHei" w:eastAsia="Microsoft YaHei" w:cs="Microsoft YaHei"/>
         </w:rPr>
-        <w:t>测试项：</w:t>
+        <w:t>测试项（共 17 个）：</w:t>
       </w:r>
     </w:p>
     <w:p>
@@ -938,7 +977,7 @@
           <w:sz w:val="21"/>
           <w:rFonts w:ascii="Microsoft YaHei" w:hAnsi="Microsoft YaHei" w:eastAsia="Microsoft YaHei" w:cs="Microsoft YaHei"/>
         </w:rPr>
-        <w:t>单元：test_ring_buffer, test_shm_layout, test_dma_manager, test_trace_log</w:t>
+        <w:t>单元 P1/P2/P3：test_ring_buffer, test_shm_layout, test_dma_manager, test_trace_log, test_eth_shm, test_link_model</w:t>
       </w:r>
     </w:p>
     <w:p>
@@ -951,7 +990,33 @@
           <w:sz w:val="21"/>
           <w:rFonts w:ascii="Microsoft YaHei" w:hAnsi="Microsoft YaHei" w:eastAsia="Microsoft YaHei" w:cs="Microsoft YaHei"/>
         </w:rPr>
-        <w:t>集成：test_sock_sync, test_bridge_loopback, test_dma_roundtrip, test_msi_roundtrip, test_precise_mode</w:t>
+        <w:t>集成 PCIe：test_sock_sync, test_bridge_loopback, test_dma_roundtrip, test_msi_roundtrip, test_precise_mode</w:t>
+      </w:r>
+    </w:p>
+    <w:p>
+      <w:pPr>
+        <w:pStyle w:val="ListBullet"/>
+        <w:spacing w:after="40"/>
+      </w:pPr>
+      <w:r>
+        <w:rPr>
+          <w:sz w:val="21"/>
+          <w:rFonts w:ascii="Microsoft YaHei" w:hAnsi="Microsoft YaHei" w:eastAsia="Microsoft YaHei" w:cs="Microsoft YaHei"/>
+        </w:rPr>
+        <w:t>集成 ETH（P3）：test_eth_loopback, test_link_drop, test_mac_stub_e2e, test_time_sync_loose</w:t>
+      </w:r>
+    </w:p>
+    <w:p>
+      <w:pPr>
+        <w:pStyle w:val="ListBullet"/>
+        <w:spacing w:after="40"/>
+      </w:pPr>
+      <w:r>
+        <w:rPr>
+          <w:sz w:val="21"/>
+          <w:rFonts w:ascii="Microsoft YaHei" w:hAnsi="Microsoft YaHei" w:eastAsia="Microsoft YaHei" w:cs="Microsoft YaHei"/>
+        </w:rPr>
+        <w:t>工具（P4）：test_cli_smoke, test_launch_smoke</w:t>
       </w:r>
     </w:p>
     <w:p>
@@ -3077,7 +3142,7 @@
                 <w:sz w:val="20"/>
                 <w:rFonts w:ascii="Microsoft YaHei" w:hAnsi="Microsoft YaHei" w:eastAsia="Microsoft YaHei" w:cs="Microsoft YaHei"/>
               </w:rPr>
-              <w:t>已完成，10 commits，9/9 测试通过</w:t>
+              <w:t>已完成，10 commits，5 集成测试通过</w:t>
             </w:r>
           </w:p>
         </w:tc>
@@ -3109,7 +3174,7 @@
                 <w:sz w:val="20"/>
                 <w:rFonts w:ascii="Microsoft YaHei" w:hAnsi="Microsoft YaHei" w:eastAsia="Microsoft YaHei" w:cs="Microsoft YaHei"/>
               </w:rPr>
-              <w:t>双节点 ETH 互打（bridge/eth + 双 VCS）</w:t>
+              <w:t>双节点 ETH 互打 + 链路模型 + launch_dual</w:t>
             </w:r>
           </w:p>
         </w:tc>
@@ -3124,7 +3189,7 @@
                 <w:sz w:val="20"/>
                 <w:rFonts w:ascii="Microsoft YaHei" w:hAnsi="Microsoft YaHei" w:eastAsia="Microsoft YaHei" w:cs="Microsoft YaHei"/>
               </w:rPr>
-              <w:t>未开始</w:t>
+              <w:t>已完成，7 commits，4 集成测试通过</w:t>
             </w:r>
           </w:p>
         </w:tc>
@@ -3156,7 +3221,7 @@
                 <w:sz w:val="20"/>
                 <w:rFonts w:ascii="Microsoft YaHei" w:hAnsi="Microsoft YaHei" w:eastAsia="Microsoft YaHei" w:cs="Microsoft YaHei"/>
               </w:rPr>
-              <w:t>cosim_cli, trace_analyzer, GDB 集成, CI</w:t>
+              <w:t>cosim_cli, trace_analyzer, GDB 文档, CI, smoke</w:t>
             </w:r>
           </w:p>
         </w:tc>
@@ -3171,7 +3236,7 @@
                 <w:sz w:val="20"/>
                 <w:rFonts w:ascii="Microsoft YaHei" w:hAnsi="Microsoft YaHei" w:eastAsia="Microsoft YaHei" w:cs="Microsoft YaHei"/>
               </w:rPr>
-              <w:t>未开始</w:t>
+              <w:t>已完成，6 commits，CI Run 全绿</w:t>
             </w:r>
           </w:p>
         </w:tc>
@@ -3296,6 +3361,1210 @@
           <w:rFonts w:ascii="Microsoft YaHei" w:hAnsi="Microsoft YaHei" w:eastAsia="Microsoft YaHei" w:cs="Microsoft YaHei"/>
         </w:rPr>
         <w:t>CI：GitHub Actions 跑 make test；VCS 侧 smoke test 留为 manual trigger</w:t>
+      </w:r>
+    </w:p>
+    <w:p>
+      <w:r>
+        <w:br w:type="page"/>
+      </w:r>
+    </w:p>
+    <w:p>
+      <w:pPr>
+        <w:spacing w:before="240" w:after="120"/>
+      </w:pPr>
+      <w:r>
+        <w:rPr>
+          <w:b/>
+          <w:color w:val="1F4E79"/>
+          <w:sz w:val="40"/>
+          <w:rFonts w:ascii="Microsoft YaHei" w:hAnsi="Microsoft YaHei" w:eastAsia="Microsoft YaHei" w:cs="Microsoft YaHei"/>
+        </w:rPr>
+        <w:t>11. 双节点 ETH 互打（P3）</w:t>
+      </w:r>
+    </w:p>
+    <w:p>
+      <w:pPr>
+        <w:spacing w:after="80"/>
+      </w:pPr>
+      <w:r>
+        <w:rPr>
+          <w:b w:val="0"/>
+          <w:i w:val="0"/>
+          <w:sz w:val="21"/>
+          <w:rFonts w:ascii="Microsoft YaHei" w:hAnsi="Microsoft YaHei" w:eastAsia="Microsoft YaHei" w:cs="Microsoft YaHei"/>
+        </w:rPr>
+        <w:t>P3 增加了第二条共享内存通路（ETH SHM），允许两个 CoSim 节点（各自一对 QEMU+VCS）通过一条软件以太网链路互通。链路模型支持丢包、突发丢包、固定延迟、速率限和流控窗口；时间同步采用松耦合模式（每节点事件驱动，事件戳通过 SHM barrier 单调推进）。</w:t>
+      </w:r>
+    </w:p>
+    <w:p>
+      <w:pPr>
+        <w:spacing w:before="160" w:after="120"/>
+      </w:pPr>
+      <w:r>
+        <w:rPr>
+          <w:b/>
+          <w:color w:val="2E75B6"/>
+          <w:sz w:val="30"/>
+          <w:rFonts w:ascii="Microsoft YaHei" w:hAnsi="Microsoft YaHei" w:eastAsia="Microsoft YaHei" w:cs="Microsoft YaHei"/>
+        </w:rPr>
+        <w:t>11.1 双节点架构</w:t>
+      </w:r>
+    </w:p>
+    <w:p>
+      <w:pPr>
+        <w:pStyle w:val="ListBullet"/>
+        <w:spacing w:after="40"/>
+      </w:pPr>
+      <w:r>
+        <w:rPr>
+          <w:sz w:val="21"/>
+          <w:rFonts w:ascii="Microsoft YaHei" w:hAnsi="Microsoft YaHei" w:eastAsia="Microsoft YaHei" w:cs="Microsoft YaHei"/>
+        </w:rPr>
+        <w:t>Node A：QEMU-A + VCS-A，通过 PCIe SHM 互联</w:t>
+      </w:r>
+    </w:p>
+    <w:p>
+      <w:pPr>
+        <w:pStyle w:val="ListBullet"/>
+        <w:spacing w:after="40"/>
+      </w:pPr>
+      <w:r>
+        <w:rPr>
+          <w:sz w:val="21"/>
+          <w:rFonts w:ascii="Microsoft YaHei" w:hAnsi="Microsoft YaHei" w:eastAsia="Microsoft YaHei" w:cs="Microsoft YaHei"/>
+        </w:rPr>
+        <w:t>Node B：QEMU-B + VCS-B，通过 PCIe SHM 互联</w:t>
+      </w:r>
+    </w:p>
+    <w:p>
+      <w:pPr>
+        <w:pStyle w:val="ListBullet"/>
+        <w:spacing w:after="40"/>
+      </w:pPr>
+      <w:r>
+        <w:rPr>
+          <w:sz w:val="21"/>
+          <w:rFonts w:ascii="Microsoft YaHei" w:hAnsi="Microsoft YaHei" w:eastAsia="Microsoft YaHei" w:cs="Microsoft YaHei"/>
+        </w:rPr>
+        <w:t>ETH SHM：A 与 B 节点之间的双向帧队列（A→B 和 B→A）</w:t>
+      </w:r>
+    </w:p>
+    <w:p>
+      <w:pPr>
+        <w:pStyle w:val="ListBullet"/>
+        <w:spacing w:after="40"/>
+      </w:pPr>
+      <w:r>
+        <w:rPr>
+          <w:sz w:val="21"/>
+          <w:rFonts w:ascii="Microsoft YaHei" w:hAnsi="Microsoft YaHei" w:eastAsia="Microsoft YaHei" w:cs="Microsoft YaHei"/>
+        </w:rPr>
+        <w:t>MAC stub（mac_stub.{c,h}）：本地软件 MAC，无需真实 RTL 即可端到端</w:t>
+      </w:r>
+    </w:p>
+    <w:p>
+      <w:pPr>
+        <w:pStyle w:val="ListBullet"/>
+        <w:spacing w:after="40"/>
+      </w:pPr>
+      <w:r>
+        <w:rPr>
+          <w:sz w:val="21"/>
+          <w:rFonts w:ascii="Microsoft YaHei" w:hAnsi="Microsoft YaHei" w:eastAsia="Microsoft YaHei" w:cs="Microsoft YaHei"/>
+        </w:rPr>
+        <w:t>DPI-C 接口（eth_mac_dpi.{c,h}）：真实 RTL MAC 上线后从此接入</w:t>
+      </w:r>
+    </w:p>
+    <w:p>
+      <w:pPr>
+        <w:spacing w:before="160" w:after="120"/>
+      </w:pPr>
+      <w:r>
+        <w:rPr>
+          <w:b/>
+          <w:color w:val="2E75B6"/>
+          <w:sz w:val="30"/>
+          <w:rFonts w:ascii="Microsoft YaHei" w:hAnsi="Microsoft YaHei" w:eastAsia="Microsoft YaHei" w:cs="Microsoft YaHei"/>
+        </w:rPr>
+        <w:t>11.2 启动双节点（launch_dual.py）</w:t>
+      </w:r>
+    </w:p>
+    <w:p>
+      <w:pPr>
+        <w:spacing w:before="40" w:after="120"/>
+        <w:ind w:left="227"/>
+        <w:shd w:val="clear" w:color="auto" w:fill="F2F2F2"/>
+      </w:pPr>
+      <w:r>
+        <w:rPr>
+          <w:rFonts w:ascii="Consolas" w:hAnsi="Consolas" w:eastAsia="Consolas" w:cs="Consolas"/>
+          <w:sz w:val="19"/>
+        </w:rPr>
+        <w:t># 冒烟（不需要真实 QEMU/VCS）</w:t>
+        <w:br/>
+        <w:t>python3 scripts/launch_dual.py --launcher-cmd "sleep 10" --smoke</w:t>
+        <w:br/>
+        <w:br/>
+        <w:t># 真实双节点（需要 run_cosim.sh 已配置好 QEMU 镜像）</w:t>
+        <w:br/>
+        <w:t>python3 scripts/launch_dual.py \</w:t>
+        <w:br/>
+        <w:t xml:space="preserve">    --shm-pcie-a /cosim-pcie-a --sock-a /tmp/cosim-a.sock \</w:t>
+        <w:br/>
+        <w:t xml:space="preserve">    --shm-pcie-b /cosim-pcie-b --sock-b /tmp/cosim-b.sock \</w:t>
+        <w:br/>
+        <w:t xml:space="preserve">    --shm-eth   /cosim-eth0</w:t>
+        <w:br/>
+        <w:br/>
+        <w:t># SSH 远程模式（节点 B 跑在另一台机器上）</w:t>
+        <w:br/>
+        <w:t>python3 scripts/launch_dual.py --mode ssh --node-b-host bob@dev.lan</w:t>
+      </w:r>
+    </w:p>
+    <w:p>
+      <w:pPr>
+        <w:spacing w:before="160" w:after="120"/>
+      </w:pPr>
+      <w:r>
+        <w:rPr>
+          <w:b/>
+          <w:color w:val="2E75B6"/>
+          <w:sz w:val="30"/>
+          <w:rFonts w:ascii="Microsoft YaHei" w:hAnsi="Microsoft YaHei" w:eastAsia="Microsoft YaHei" w:cs="Microsoft YaHei"/>
+        </w:rPr>
+        <w:t>11.3 链路模型配置</w:t>
+      </w:r>
+    </w:p>
+    <w:tbl>
+      <w:tblPr>
+        <w:tblStyle w:val="LightGrid-Accent1"/>
+        <w:tblW w:type="auto" w:w="0"/>
+        <w:tblLayout w:type="autofit"/>
+        <w:tblLook w:firstColumn="1" w:firstRow="1" w:lastColumn="0" w:lastRow="0" w:noHBand="0" w:noVBand="1" w:val="04A0"/>
+      </w:tblPr>
+      <w:tblGrid>
+        <w:gridCol w:w="2160"/>
+        <w:gridCol w:w="2160"/>
+        <w:gridCol w:w="2160"/>
+        <w:gridCol w:w="2160"/>
+      </w:tblGrid>
+      <w:tr>
+        <w:tc>
+          <w:tcPr>
+            <w:tcW w:type="dxa" w:w="2160"/>
+            <w:vAlign w:val="center"/>
+          </w:tcPr>
+          <w:p>
+            <w:pPr>
+              <w:jc w:val="center"/>
+            </w:pPr>
+            <w:r>
+              <w:rPr>
+                <w:b/>
+                <w:sz w:val="21"/>
+                <w:rFonts w:ascii="Microsoft YaHei" w:hAnsi="Microsoft YaHei" w:eastAsia="Microsoft YaHei" w:cs="Microsoft YaHei"/>
+              </w:rPr>
+              <w:t>字段</w:t>
+            </w:r>
+          </w:p>
+        </w:tc>
+        <w:tc>
+          <w:tcPr>
+            <w:tcW w:type="dxa" w:w="2160"/>
+            <w:vAlign w:val="center"/>
+          </w:tcPr>
+          <w:p>
+            <w:pPr>
+              <w:jc w:val="center"/>
+            </w:pPr>
+            <w:r>
+              <w:rPr>
+                <w:b/>
+                <w:sz w:val="21"/>
+                <w:rFonts w:ascii="Microsoft YaHei" w:hAnsi="Microsoft YaHei" w:eastAsia="Microsoft YaHei" w:cs="Microsoft YaHei"/>
+              </w:rPr>
+              <w:t>类型</w:t>
+            </w:r>
+          </w:p>
+        </w:tc>
+        <w:tc>
+          <w:tcPr>
+            <w:tcW w:type="dxa" w:w="2160"/>
+            <w:vAlign w:val="center"/>
+          </w:tcPr>
+          <w:p>
+            <w:pPr>
+              <w:jc w:val="center"/>
+            </w:pPr>
+            <w:r>
+              <w:rPr>
+                <w:b/>
+                <w:sz w:val="21"/>
+                <w:rFonts w:ascii="Microsoft YaHei" w:hAnsi="Microsoft YaHei" w:eastAsia="Microsoft YaHei" w:cs="Microsoft YaHei"/>
+              </w:rPr>
+              <w:t>示例</w:t>
+            </w:r>
+          </w:p>
+        </w:tc>
+        <w:tc>
+          <w:tcPr>
+            <w:tcW w:type="dxa" w:w="2160"/>
+            <w:vAlign w:val="center"/>
+          </w:tcPr>
+          <w:p>
+            <w:pPr>
+              <w:jc w:val="center"/>
+            </w:pPr>
+            <w:r>
+              <w:rPr>
+                <w:b/>
+                <w:sz w:val="21"/>
+                <w:rFonts w:ascii="Microsoft YaHei" w:hAnsi="Microsoft YaHei" w:eastAsia="Microsoft YaHei" w:cs="Microsoft YaHei"/>
+              </w:rPr>
+              <w:t>说明</w:t>
+            </w:r>
+          </w:p>
+        </w:tc>
+      </w:tr>
+      <w:tr>
+        <w:tc>
+          <w:tcPr>
+            <w:tcW w:type="dxa" w:w="2160"/>
+            <w:vAlign w:val="center"/>
+          </w:tcPr>
+          <w:p>
+            <w:r>
+              <w:rPr>
+                <w:sz w:val="20"/>
+                <w:rFonts w:ascii="Microsoft YaHei" w:hAnsi="Microsoft YaHei" w:eastAsia="Microsoft YaHei" w:cs="Microsoft YaHei"/>
+              </w:rPr>
+              <w:t>drop_rate_ppm</w:t>
+            </w:r>
+          </w:p>
+        </w:tc>
+        <w:tc>
+          <w:tcPr>
+            <w:tcW w:type="dxa" w:w="2160"/>
+            <w:vAlign w:val="center"/>
+          </w:tcPr>
+          <w:p>
+            <w:r>
+              <w:rPr>
+                <w:sz w:val="20"/>
+                <w:rFonts w:ascii="Microsoft YaHei" w:hAnsi="Microsoft YaHei" w:eastAsia="Microsoft YaHei" w:cs="Microsoft YaHei"/>
+              </w:rPr>
+              <w:t>u32</w:t>
+            </w:r>
+          </w:p>
+        </w:tc>
+        <w:tc>
+          <w:tcPr>
+            <w:tcW w:type="dxa" w:w="2160"/>
+            <w:vAlign w:val="center"/>
+          </w:tcPr>
+          <w:p>
+            <w:r>
+              <w:rPr>
+                <w:sz w:val="20"/>
+                <w:rFonts w:ascii="Microsoft YaHei" w:hAnsi="Microsoft YaHei" w:eastAsia="Microsoft YaHei" w:cs="Microsoft YaHei"/>
+              </w:rPr>
+              <w:t>100000</w:t>
+            </w:r>
+          </w:p>
+        </w:tc>
+        <w:tc>
+          <w:tcPr>
+            <w:tcW w:type="dxa" w:w="2160"/>
+            <w:vAlign w:val="center"/>
+          </w:tcPr>
+          <w:p>
+            <w:r>
+              <w:rPr>
+                <w:sz w:val="20"/>
+                <w:rFonts w:ascii="Microsoft YaHei" w:hAnsi="Microsoft YaHei" w:eastAsia="Microsoft YaHei" w:cs="Microsoft YaHei"/>
+              </w:rPr>
+              <w:t>每百万帧的进入丢包概率（10%）</w:t>
+            </w:r>
+          </w:p>
+        </w:tc>
+      </w:tr>
+      <w:tr>
+        <w:tc>
+          <w:tcPr>
+            <w:tcW w:type="dxa" w:w="2160"/>
+            <w:vAlign w:val="center"/>
+          </w:tcPr>
+          <w:p>
+            <w:r>
+              <w:rPr>
+                <w:sz w:val="20"/>
+                <w:rFonts w:ascii="Microsoft YaHei" w:hAnsi="Microsoft YaHei" w:eastAsia="Microsoft YaHei" w:cs="Microsoft YaHei"/>
+              </w:rPr>
+              <w:t>burst_drop_len</w:t>
+            </w:r>
+          </w:p>
+        </w:tc>
+        <w:tc>
+          <w:tcPr>
+            <w:tcW w:type="dxa" w:w="2160"/>
+            <w:vAlign w:val="center"/>
+          </w:tcPr>
+          <w:p>
+            <w:r>
+              <w:rPr>
+                <w:sz w:val="20"/>
+                <w:rFonts w:ascii="Microsoft YaHei" w:hAnsi="Microsoft YaHei" w:eastAsia="Microsoft YaHei" w:cs="Microsoft YaHei"/>
+              </w:rPr>
+              <w:t>u16</w:t>
+            </w:r>
+          </w:p>
+        </w:tc>
+        <w:tc>
+          <w:tcPr>
+            <w:tcW w:type="dxa" w:w="2160"/>
+            <w:vAlign w:val="center"/>
+          </w:tcPr>
+          <w:p>
+            <w:r>
+              <w:rPr>
+                <w:sz w:val="20"/>
+                <w:rFonts w:ascii="Microsoft YaHei" w:hAnsi="Microsoft YaHei" w:eastAsia="Microsoft YaHei" w:cs="Microsoft YaHei"/>
+              </w:rPr>
+              <w:t>5</w:t>
+            </w:r>
+          </w:p>
+        </w:tc>
+        <w:tc>
+          <w:tcPr>
+            <w:tcW w:type="dxa" w:w="2160"/>
+            <w:vAlign w:val="center"/>
+          </w:tcPr>
+          <w:p>
+            <w:r>
+              <w:rPr>
+                <w:sz w:val="20"/>
+                <w:rFonts w:ascii="Microsoft YaHei" w:hAnsi="Microsoft YaHei" w:eastAsia="Microsoft YaHei" w:cs="Microsoft YaHei"/>
+              </w:rPr>
+              <w:t>一旦触发，连续丢的帧数</w:t>
+            </w:r>
+          </w:p>
+        </w:tc>
+      </w:tr>
+      <w:tr>
+        <w:tc>
+          <w:tcPr>
+            <w:tcW w:type="dxa" w:w="2160"/>
+            <w:vAlign w:val="center"/>
+          </w:tcPr>
+          <w:p>
+            <w:r>
+              <w:rPr>
+                <w:sz w:val="20"/>
+                <w:rFonts w:ascii="Microsoft YaHei" w:hAnsi="Microsoft YaHei" w:eastAsia="Microsoft YaHei" w:cs="Microsoft YaHei"/>
+              </w:rPr>
+              <w:t>latency_ns</w:t>
+            </w:r>
+          </w:p>
+        </w:tc>
+        <w:tc>
+          <w:tcPr>
+            <w:tcW w:type="dxa" w:w="2160"/>
+            <w:vAlign w:val="center"/>
+          </w:tcPr>
+          <w:p>
+            <w:r>
+              <w:rPr>
+                <w:sz w:val="20"/>
+                <w:rFonts w:ascii="Microsoft YaHei" w:hAnsi="Microsoft YaHei" w:eastAsia="Microsoft YaHei" w:cs="Microsoft YaHei"/>
+              </w:rPr>
+              <w:t>u64</w:t>
+            </w:r>
+          </w:p>
+        </w:tc>
+        <w:tc>
+          <w:tcPr>
+            <w:tcW w:type="dxa" w:w="2160"/>
+            <w:vAlign w:val="center"/>
+          </w:tcPr>
+          <w:p>
+            <w:r>
+              <w:rPr>
+                <w:sz w:val="20"/>
+                <w:rFonts w:ascii="Microsoft YaHei" w:hAnsi="Microsoft YaHei" w:eastAsia="Microsoft YaHei" w:cs="Microsoft YaHei"/>
+              </w:rPr>
+              <w:t>5000</w:t>
+            </w:r>
+          </w:p>
+        </w:tc>
+        <w:tc>
+          <w:tcPr>
+            <w:tcW w:type="dxa" w:w="2160"/>
+            <w:vAlign w:val="center"/>
+          </w:tcPr>
+          <w:p>
+            <w:r>
+              <w:rPr>
+                <w:sz w:val="20"/>
+                <w:rFonts w:ascii="Microsoft YaHei" w:hAnsi="Microsoft YaHei" w:eastAsia="Microsoft YaHei" w:cs="Microsoft YaHei"/>
+              </w:rPr>
+              <w:t>每帧固定单向延迟（5us）</w:t>
+            </w:r>
+          </w:p>
+        </w:tc>
+      </w:tr>
+      <w:tr>
+        <w:tc>
+          <w:tcPr>
+            <w:tcW w:type="dxa" w:w="2160"/>
+            <w:vAlign w:val="center"/>
+          </w:tcPr>
+          <w:p>
+            <w:r>
+              <w:rPr>
+                <w:sz w:val="20"/>
+                <w:rFonts w:ascii="Microsoft YaHei" w:hAnsi="Microsoft YaHei" w:eastAsia="Microsoft YaHei" w:cs="Microsoft YaHei"/>
+              </w:rPr>
+              <w:t>rate_mbps</w:t>
+            </w:r>
+          </w:p>
+        </w:tc>
+        <w:tc>
+          <w:tcPr>
+            <w:tcW w:type="dxa" w:w="2160"/>
+            <w:vAlign w:val="center"/>
+          </w:tcPr>
+          <w:p>
+            <w:r>
+              <w:rPr>
+                <w:sz w:val="20"/>
+                <w:rFonts w:ascii="Microsoft YaHei" w:hAnsi="Microsoft YaHei" w:eastAsia="Microsoft YaHei" w:cs="Microsoft YaHei"/>
+              </w:rPr>
+              <w:t>u32</w:t>
+            </w:r>
+          </w:p>
+        </w:tc>
+        <w:tc>
+          <w:tcPr>
+            <w:tcW w:type="dxa" w:w="2160"/>
+            <w:vAlign w:val="center"/>
+          </w:tcPr>
+          <w:p>
+            <w:r>
+              <w:rPr>
+                <w:sz w:val="20"/>
+                <w:rFonts w:ascii="Microsoft YaHei" w:hAnsi="Microsoft YaHei" w:eastAsia="Microsoft YaHei" w:cs="Microsoft YaHei"/>
+              </w:rPr>
+              <w:t>1000</w:t>
+            </w:r>
+          </w:p>
+        </w:tc>
+        <w:tc>
+          <w:tcPr>
+            <w:tcW w:type="dxa" w:w="2160"/>
+            <w:vAlign w:val="center"/>
+          </w:tcPr>
+          <w:p>
+            <w:r>
+              <w:rPr>
+                <w:sz w:val="20"/>
+                <w:rFonts w:ascii="Microsoft YaHei" w:hAnsi="Microsoft YaHei" w:eastAsia="Microsoft YaHei" w:cs="Microsoft YaHei"/>
+              </w:rPr>
+              <w:t>线速率，0 = 无限</w:t>
+            </w:r>
+          </w:p>
+        </w:tc>
+      </w:tr>
+      <w:tr>
+        <w:tc>
+          <w:tcPr>
+            <w:tcW w:type="dxa" w:w="2160"/>
+            <w:vAlign w:val="center"/>
+          </w:tcPr>
+          <w:p>
+            <w:r>
+              <w:rPr>
+                <w:sz w:val="20"/>
+                <w:rFonts w:ascii="Microsoft YaHei" w:hAnsi="Microsoft YaHei" w:eastAsia="Microsoft YaHei" w:cs="Microsoft YaHei"/>
+              </w:rPr>
+              <w:t>fc_window</w:t>
+            </w:r>
+          </w:p>
+        </w:tc>
+        <w:tc>
+          <w:tcPr>
+            <w:tcW w:type="dxa" w:w="2160"/>
+            <w:vAlign w:val="center"/>
+          </w:tcPr>
+          <w:p>
+            <w:r>
+              <w:rPr>
+                <w:sz w:val="20"/>
+                <w:rFonts w:ascii="Microsoft YaHei" w:hAnsi="Microsoft YaHei" w:eastAsia="Microsoft YaHei" w:cs="Microsoft YaHei"/>
+              </w:rPr>
+              <w:t>u32</w:t>
+            </w:r>
+          </w:p>
+        </w:tc>
+        <w:tc>
+          <w:tcPr>
+            <w:tcW w:type="dxa" w:w="2160"/>
+            <w:vAlign w:val="center"/>
+          </w:tcPr>
+          <w:p>
+            <w:r>
+              <w:rPr>
+                <w:sz w:val="20"/>
+                <w:rFonts w:ascii="Microsoft YaHei" w:hAnsi="Microsoft YaHei" w:eastAsia="Microsoft YaHei" w:cs="Microsoft YaHei"/>
+              </w:rPr>
+              <w:t>4</w:t>
+            </w:r>
+          </w:p>
+        </w:tc>
+        <w:tc>
+          <w:tcPr>
+            <w:tcW w:type="dxa" w:w="2160"/>
+            <w:vAlign w:val="center"/>
+          </w:tcPr>
+          <w:p>
+            <w:r>
+              <w:rPr>
+                <w:sz w:val="20"/>
+                <w:rFonts w:ascii="Microsoft YaHei" w:hAnsi="Microsoft YaHei" w:eastAsia="Microsoft YaHei" w:cs="Microsoft YaHei"/>
+              </w:rPr>
+              <w:t>最大在飞帧数（流控），0 = 无限</w:t>
+            </w:r>
+          </w:p>
+        </w:tc>
+      </w:tr>
+    </w:tbl>
+    <w:p/>
+    <w:p>
+      <w:pPr>
+        <w:spacing w:before="40" w:after="120"/>
+        <w:ind w:left="227"/>
+        <w:shd w:val="clear" w:color="auto" w:fill="F2F2F2"/>
+      </w:pPr>
+      <w:r>
+        <w:rPr>
+          <w:rFonts w:ascii="Consolas" w:hAnsi="Consolas" w:eastAsia="Consolas" w:cs="Consolas"/>
+          <w:sz w:val="19"/>
+        </w:rPr>
+        <w:t>/* C 侧示例：模拟 1Gbps 链路 + 10% 丢包 + 4 帧 FC 窗口 */</w:t>
+        <w:br/>
+        <w:t>eth_port_t port = {0};</w:t>
+        <w:br/>
+        <w:t>port.link.drop_rate_ppm  = 100000;</w:t>
+        <w:br/>
+        <w:t>port.link.burst_drop_len = 1;</w:t>
+        <w:br/>
+        <w:t>port.link.latency_ns     = 5000;</w:t>
+        <w:br/>
+        <w:t>port.link.rate_mbps      = 1000;</w:t>
+        <w:br/>
+        <w:t>port.link.fc_window      = 4;</w:t>
+        <w:br/>
+        <w:t>eth_port_open(&amp;port, "/cosim-eth0", ETH_ROLE_A, 1);</w:t>
+      </w:r>
+    </w:p>
+    <w:p>
+      <w:pPr>
+        <w:spacing w:before="160" w:after="120"/>
+      </w:pPr>
+      <w:r>
+        <w:rPr>
+          <w:b/>
+          <w:color w:val="2E75B6"/>
+          <w:sz w:val="30"/>
+          <w:rFonts w:ascii="Microsoft YaHei" w:hAnsi="Microsoft YaHei" w:eastAsia="Microsoft YaHei" w:cs="Microsoft YaHei"/>
+        </w:rPr>
+        <w:t>11.4 ETH API（eth_port.h）</w:t>
+      </w:r>
+    </w:p>
+    <w:tbl>
+      <w:tblPr>
+        <w:tblStyle w:val="LightGrid-Accent1"/>
+        <w:tblW w:type="auto" w:w="0"/>
+        <w:tblLayout w:type="autofit"/>
+        <w:tblLook w:firstColumn="1" w:firstRow="1" w:lastColumn="0" w:lastRow="0" w:noHBand="0" w:noVBand="1" w:val="04A0"/>
+      </w:tblPr>
+      <w:tblGrid>
+        <w:gridCol w:w="4320"/>
+        <w:gridCol w:w="4320"/>
+      </w:tblGrid>
+      <w:tr>
+        <w:tc>
+          <w:tcPr>
+            <w:tcW w:type="dxa" w:w="4320"/>
+            <w:vAlign w:val="center"/>
+          </w:tcPr>
+          <w:p>
+            <w:pPr>
+              <w:jc w:val="center"/>
+            </w:pPr>
+            <w:r>
+              <w:rPr>
+                <w:b/>
+                <w:sz w:val="21"/>
+                <w:rFonts w:ascii="Microsoft YaHei" w:hAnsi="Microsoft YaHei" w:eastAsia="Microsoft YaHei" w:cs="Microsoft YaHei"/>
+              </w:rPr>
+              <w:t>函数</w:t>
+            </w:r>
+          </w:p>
+        </w:tc>
+        <w:tc>
+          <w:tcPr>
+            <w:tcW w:type="dxa" w:w="4320"/>
+            <w:vAlign w:val="center"/>
+          </w:tcPr>
+          <w:p>
+            <w:pPr>
+              <w:jc w:val="center"/>
+            </w:pPr>
+            <w:r>
+              <w:rPr>
+                <w:b/>
+                <w:sz w:val="21"/>
+                <w:rFonts w:ascii="Microsoft YaHei" w:hAnsi="Microsoft YaHei" w:eastAsia="Microsoft YaHei" w:cs="Microsoft YaHei"/>
+              </w:rPr>
+              <w:t>说明</w:t>
+            </w:r>
+          </w:p>
+        </w:tc>
+      </w:tr>
+      <w:tr>
+        <w:tc>
+          <w:tcPr>
+            <w:tcW w:type="dxa" w:w="4320"/>
+            <w:vAlign w:val="center"/>
+          </w:tcPr>
+          <w:p>
+            <w:r>
+              <w:rPr>
+                <w:sz w:val="20"/>
+                <w:rFonts w:ascii="Microsoft YaHei" w:hAnsi="Microsoft YaHei" w:eastAsia="Microsoft YaHei" w:cs="Microsoft YaHei"/>
+              </w:rPr>
+              <w:t>eth_port_open(port, name, role, create)</w:t>
+            </w:r>
+          </w:p>
+        </w:tc>
+        <w:tc>
+          <w:tcPr>
+            <w:tcW w:type="dxa" w:w="4320"/>
+            <w:vAlign w:val="center"/>
+          </w:tcPr>
+          <w:p>
+            <w:r>
+              <w:rPr>
+                <w:sz w:val="20"/>
+                <w:rFonts w:ascii="Microsoft YaHei" w:hAnsi="Microsoft YaHei" w:eastAsia="Microsoft YaHei" w:cs="Microsoft YaHei"/>
+              </w:rPr>
+              <w:t>打开 ETH 端口，绑定 SHM 与角色（A/B）</w:t>
+            </w:r>
+          </w:p>
+        </w:tc>
+      </w:tr>
+      <w:tr>
+        <w:tc>
+          <w:tcPr>
+            <w:tcW w:type="dxa" w:w="4320"/>
+            <w:vAlign w:val="center"/>
+          </w:tcPr>
+          <w:p>
+            <w:r>
+              <w:rPr>
+                <w:sz w:val="20"/>
+                <w:rFonts w:ascii="Microsoft YaHei" w:hAnsi="Microsoft YaHei" w:eastAsia="Microsoft YaHei" w:cs="Microsoft YaHei"/>
+              </w:rPr>
+              <w:t>eth_port_send(port, frame, now_ns)</w:t>
+            </w:r>
+          </w:p>
+        </w:tc>
+        <w:tc>
+          <w:tcPr>
+            <w:tcW w:type="dxa" w:w="4320"/>
+            <w:vAlign w:val="center"/>
+          </w:tcPr>
+          <w:p>
+            <w:r>
+              <w:rPr>
+                <w:sz w:val="20"/>
+                <w:rFonts w:ascii="Microsoft YaHei" w:hAnsi="Microsoft YaHei" w:eastAsia="Microsoft YaHei" w:cs="Microsoft YaHei"/>
+              </w:rPr>
+              <w:t>发帧；返回 0 / -1 ring full / -2 FC 阻塞 / -3 链路丢包</w:t>
+            </w:r>
+          </w:p>
+        </w:tc>
+      </w:tr>
+      <w:tr>
+        <w:tc>
+          <w:tcPr>
+            <w:tcW w:type="dxa" w:w="4320"/>
+            <w:vAlign w:val="center"/>
+          </w:tcPr>
+          <w:p>
+            <w:r>
+              <w:rPr>
+                <w:sz w:val="20"/>
+                <w:rFonts w:ascii="Microsoft YaHei" w:hAnsi="Microsoft YaHei" w:eastAsia="Microsoft YaHei" w:cs="Microsoft YaHei"/>
+              </w:rPr>
+              <w:t>eth_port_recv(port, out, timeout_ns)</w:t>
+            </w:r>
+          </w:p>
+        </w:tc>
+        <w:tc>
+          <w:tcPr>
+            <w:tcW w:type="dxa" w:w="4320"/>
+            <w:vAlign w:val="center"/>
+          </w:tcPr>
+          <w:p>
+            <w:r>
+              <w:rPr>
+                <w:sz w:val="20"/>
+                <w:rFonts w:ascii="Microsoft YaHei" w:hAnsi="Microsoft YaHei" w:eastAsia="Microsoft YaHei" w:cs="Microsoft YaHei"/>
+              </w:rPr>
+              <w:t>收帧；timeout=0 非阻塞，&gt;0 阻塞超时</w:t>
+            </w:r>
+          </w:p>
+        </w:tc>
+      </w:tr>
+      <w:tr>
+        <w:tc>
+          <w:tcPr>
+            <w:tcW w:type="dxa" w:w="4320"/>
+            <w:vAlign w:val="center"/>
+          </w:tcPr>
+          <w:p>
+            <w:r>
+              <w:rPr>
+                <w:sz w:val="20"/>
+                <w:rFonts w:ascii="Microsoft YaHei" w:hAnsi="Microsoft YaHei" w:eastAsia="Microsoft YaHei" w:cs="Microsoft YaHei"/>
+              </w:rPr>
+              <w:t>eth_port_tx_complete(port)</w:t>
+            </w:r>
+          </w:p>
+        </w:tc>
+        <w:tc>
+          <w:tcPr>
+            <w:tcW w:type="dxa" w:w="4320"/>
+            <w:vAlign w:val="center"/>
+          </w:tcPr>
+          <w:p>
+            <w:r>
+              <w:rPr>
+                <w:sz w:val="20"/>
+                <w:rFonts w:ascii="Microsoft YaHei" w:hAnsi="Microsoft YaHei" w:eastAsia="Microsoft YaHei" w:cs="Microsoft YaHei"/>
+              </w:rPr>
+              <w:t>对端已消费 → 减 outstanding（FC 用）</w:t>
+            </w:r>
+          </w:p>
+        </w:tc>
+      </w:tr>
+      <w:tr>
+        <w:tc>
+          <w:tcPr>
+            <w:tcW w:type="dxa" w:w="4320"/>
+            <w:vAlign w:val="center"/>
+          </w:tcPr>
+          <w:p>
+            <w:r>
+              <w:rPr>
+                <w:sz w:val="20"/>
+                <w:rFonts w:ascii="Microsoft YaHei" w:hAnsi="Microsoft YaHei" w:eastAsia="Microsoft YaHei" w:cs="Microsoft YaHei"/>
+              </w:rPr>
+              <w:t>eth_port_close(port)</w:t>
+            </w:r>
+          </w:p>
+        </w:tc>
+        <w:tc>
+          <w:tcPr>
+            <w:tcW w:type="dxa" w:w="4320"/>
+            <w:vAlign w:val="center"/>
+          </w:tcPr>
+          <w:p>
+            <w:r>
+              <w:rPr>
+                <w:sz w:val="20"/>
+                <w:rFonts w:ascii="Microsoft YaHei" w:hAnsi="Microsoft YaHei" w:eastAsia="Microsoft YaHei" w:cs="Microsoft YaHei"/>
+              </w:rPr>
+              <w:t>关闭端口，owned_shm=1 时自动 unlink SHM</w:t>
+            </w:r>
+          </w:p>
+        </w:tc>
+      </w:tr>
+      <w:tr>
+        <w:tc>
+          <w:tcPr>
+            <w:tcW w:type="dxa" w:w="4320"/>
+            <w:vAlign w:val="center"/>
+          </w:tcPr>
+          <w:p>
+            <w:r>
+              <w:rPr>
+                <w:sz w:val="20"/>
+                <w:rFonts w:ascii="Microsoft YaHei" w:hAnsi="Microsoft YaHei" w:eastAsia="Microsoft YaHei" w:cs="Microsoft YaHei"/>
+              </w:rPr>
+              <w:t>eth_shm_advance_time(shm, role, ns)</w:t>
+            </w:r>
+          </w:p>
+        </w:tc>
+        <w:tc>
+          <w:tcPr>
+            <w:tcW w:type="dxa" w:w="4320"/>
+            <w:vAlign w:val="center"/>
+          </w:tcPr>
+          <w:p>
+            <w:r>
+              <w:rPr>
+                <w:sz w:val="20"/>
+                <w:rFonts w:ascii="Microsoft YaHei" w:hAnsi="Microsoft YaHei" w:eastAsia="Microsoft YaHei" w:cs="Microsoft YaHei"/>
+              </w:rPr>
+              <w:t>松耦合：发布本节点 sim 时间</w:t>
+            </w:r>
+          </w:p>
+        </w:tc>
+      </w:tr>
+      <w:tr>
+        <w:tc>
+          <w:tcPr>
+            <w:tcW w:type="dxa" w:w="4320"/>
+            <w:vAlign w:val="center"/>
+          </w:tcPr>
+          <w:p>
+            <w:r>
+              <w:rPr>
+                <w:sz w:val="20"/>
+                <w:rFonts w:ascii="Microsoft YaHei" w:hAnsi="Microsoft YaHei" w:eastAsia="Microsoft YaHei" w:cs="Microsoft YaHei"/>
+              </w:rPr>
+              <w:t>eth_shm_peer_time(shm, self_role)</w:t>
+            </w:r>
+          </w:p>
+        </w:tc>
+        <w:tc>
+          <w:tcPr>
+            <w:tcW w:type="dxa" w:w="4320"/>
+            <w:vAlign w:val="center"/>
+          </w:tcPr>
+          <w:p>
+            <w:r>
+              <w:rPr>
+                <w:sz w:val="20"/>
+                <w:rFonts w:ascii="Microsoft YaHei" w:hAnsi="Microsoft YaHei" w:eastAsia="Microsoft YaHei" w:cs="Microsoft YaHei"/>
+              </w:rPr>
+              <w:t>松耦合：读取对方节点最近时间</w:t>
+            </w:r>
+          </w:p>
+        </w:tc>
+      </w:tr>
+    </w:tbl>
+    <w:p/>
+    <w:p>
+      <w:pPr>
+        <w:spacing w:before="160" w:after="120"/>
+      </w:pPr>
+      <w:r>
+        <w:rPr>
+          <w:b/>
+          <w:color w:val="2E75B6"/>
+          <w:sz w:val="30"/>
+          <w:rFonts w:ascii="Microsoft YaHei" w:hAnsi="Microsoft YaHei" w:eastAsia="Microsoft YaHei" w:cs="Microsoft YaHei"/>
+        </w:rPr>
+        <w:t>11.5 VCS RTL MAC 接入路径</w:t>
+      </w:r>
+    </w:p>
+    <w:p>
+      <w:pPr>
+        <w:spacing w:after="80"/>
+      </w:pPr>
+      <w:r>
+        <w:rPr>
+          <w:b w:val="0"/>
+          <w:i w:val="0"/>
+          <w:sz w:val="21"/>
+          <w:rFonts w:ascii="Microsoft YaHei" w:hAnsi="Microsoft YaHei" w:eastAsia="Microsoft YaHei" w:cs="Microsoft YaHei"/>
+        </w:rPr>
+        <w:t>当真实 MAC RTL 就绪时，按以下步骤替换 MAC stub：</w:t>
+      </w:r>
+    </w:p>
+    <w:p>
+      <w:pPr>
+        <w:pStyle w:val="ListBullet"/>
+        <w:spacing w:after="40"/>
+      </w:pPr>
+      <w:r>
+        <w:rPr>
+          <w:sz w:val="21"/>
+          <w:rFonts w:ascii="Microsoft YaHei" w:hAnsi="Microsoft YaHei" w:eastAsia="Microsoft YaHei" w:cs="Microsoft YaHei"/>
+        </w:rPr>
+        <w:t>在 SystemVerilog 顶层 import "DPI-C" 声明 vcs_eth_mac_*_dpi 函数</w:t>
+      </w:r>
+    </w:p>
+    <w:p>
+      <w:pPr>
+        <w:pStyle w:val="ListBullet"/>
+        <w:spacing w:after="40"/>
+      </w:pPr>
+      <w:r>
+        <w:rPr>
+          <w:sz w:val="21"/>
+          <w:rFonts w:ascii="Microsoft YaHei" w:hAnsi="Microsoft YaHei" w:eastAsia="Microsoft YaHei" w:cs="Microsoft YaHei"/>
+        </w:rPr>
+        <w:t>RTL MAC TX：MAC 输出帧后调 vcs_eth_mac_send_frame_dpi(data, len)</w:t>
+      </w:r>
+    </w:p>
+    <w:p>
+      <w:pPr>
+        <w:pStyle w:val="ListBullet"/>
+        <w:spacing w:after="40"/>
+      </w:pPr>
+      <w:r>
+        <w:rPr>
+          <w:sz w:val="21"/>
+          <w:rFonts w:ascii="Microsoft YaHei" w:hAnsi="Microsoft YaHei" w:eastAsia="Microsoft YaHei" w:cs="Microsoft YaHei"/>
+        </w:rPr>
+        <w:t>RTL MAC RX 轮询：每周期或空闲调 vcs_eth_mac_poll_frame_dpi(buf, max_len)</w:t>
+      </w:r>
+    </w:p>
+    <w:p>
+      <w:pPr>
+        <w:pStyle w:val="ListBullet"/>
+        <w:spacing w:after="40"/>
+      </w:pPr>
+      <w:r>
+        <w:rPr>
+          <w:sz w:val="21"/>
+          <w:rFonts w:ascii="Microsoft YaHei" w:hAnsi="Microsoft YaHei" w:eastAsia="Microsoft YaHei" w:cs="Microsoft YaHei"/>
+        </w:rPr>
+        <w:t>复位 / 关闭：vcs_eth_mac_close_dpi()</w:t>
+      </w:r>
+    </w:p>
+    <w:p>
+      <w:pPr>
+        <w:pStyle w:val="ListBullet"/>
+        <w:spacing w:after="40"/>
+      </w:pPr>
+      <w:r>
+        <w:rPr>
+          <w:sz w:val="21"/>
+          <w:rFonts w:ascii="Microsoft YaHei" w:hAnsi="Microsoft YaHei" w:eastAsia="Microsoft YaHei" w:cs="Microsoft YaHei"/>
+        </w:rPr>
+        <w:t>链路参数运行时调整：vcs_eth_mac_configure_link_dpi(...)</w:t>
+      </w:r>
+    </w:p>
+    <w:p>
+      <w:r>
+        <w:br w:type="page"/>
+      </w:r>
+    </w:p>
+    <w:p>
+      <w:pPr>
+        <w:spacing w:before="240" w:after="120"/>
+      </w:pPr>
+      <w:r>
+        <w:rPr>
+          <w:b/>
+          <w:color w:val="1F4E79"/>
+          <w:sz w:val="40"/>
+          <w:rFonts w:ascii="Microsoft YaHei" w:hAnsi="Microsoft YaHei" w:eastAsia="Microsoft YaHei" w:cs="Microsoft YaHei"/>
+        </w:rPr>
+        <w:t>12. 调试工具（P4）</w:t>
+      </w:r>
+    </w:p>
+    <w:p>
+      <w:pPr>
+        <w:spacing w:before="160" w:after="120"/>
+      </w:pPr>
+      <w:r>
+        <w:rPr>
+          <w:b/>
+          <w:color w:val="2E75B6"/>
+          <w:sz w:val="30"/>
+          <w:rFonts w:ascii="Microsoft YaHei" w:hAnsi="Microsoft YaHei" w:eastAsia="Microsoft YaHei" w:cs="Microsoft YaHei"/>
+        </w:rPr>
+        <w:t>12.1 cosim_cli 交互式控制台</w:t>
+      </w:r>
+    </w:p>
+    <w:p>
+      <w:pPr>
+        <w:spacing w:before="40" w:after="120"/>
+        <w:ind w:left="227"/>
+        <w:shd w:val="clear" w:color="auto" w:fill="F2F2F2"/>
+      </w:pPr>
+      <w:r>
+        <w:rPr>
+          <w:rFonts w:ascii="Consolas" w:hAnsi="Consolas" w:eastAsia="Consolas" w:cs="Consolas"/>
+          <w:sz w:val="19"/>
+        </w:rPr>
+        <w:t># 启动（先 make bridge）</w:t>
+        <w:br/>
+        <w:t>python3 scripts/cosim_cli.py --shm /cosim0 --sock /tmp/cosim.sock</w:t>
+        <w:br/>
+        <w:br/>
+        <w:t># REPL 内常用命令</w:t>
+        <w:br/>
+        <w:t>cosim&gt; read 0x100</w:t>
+        <w:br/>
+        <w:t>cosim&gt; write 0x200 0xDEADBEEF 4</w:t>
+        <w:br/>
+        <w:t>cosim&gt; mode precise</w:t>
+        <w:br/>
+        <w:t>cosim&gt; advance 1000</w:t>
+        <w:br/>
+        <w:t>cosim&gt; trace on /tmp/trace.csv csv</w:t>
+        <w:br/>
+        <w:t>cosim&gt; status</w:t>
+        <w:br/>
+        <w:t>cosim&gt; quit</w:t>
+      </w:r>
+    </w:p>
+    <w:p>
+      <w:pPr>
+        <w:spacing w:before="160" w:after="120"/>
+      </w:pPr>
+      <w:r>
+        <w:rPr>
+          <w:b/>
+          <w:color w:val="2E75B6"/>
+          <w:sz w:val="30"/>
+          <w:rFonts w:ascii="Microsoft YaHei" w:hAnsi="Microsoft YaHei" w:eastAsia="Microsoft YaHei" w:cs="Microsoft YaHei"/>
+        </w:rPr>
+        <w:t>12.2 trace_analyzer 事务分析</w:t>
+      </w:r>
+    </w:p>
+    <w:p>
+      <w:pPr>
+        <w:spacing w:before="40" w:after="120"/>
+        <w:ind w:left="227"/>
+        <w:shd w:val="clear" w:color="auto" w:fill="F2F2F2"/>
+      </w:pPr>
+      <w:r>
+        <w:rPr>
+          <w:rFonts w:ascii="Consolas" w:hAnsi="Consolas" w:eastAsia="Consolas" w:cs="Consolas"/>
+          <w:sz w:val="19"/>
+        </w:rPr>
+        <w:t># 解析 CSV 或 JSON trace 文件</w:t>
+        <w:br/>
+        <w:t>python3 scripts/trace_analyzer.py /tmp/trace.csv</w:t>
+        <w:br/>
+        <w:br/>
+        <w:t># 输出包含：</w:t>
+        <w:br/>
+        <w:t>#   - 事件分布（按 kind / type）</w:t>
+        <w:br/>
+        <w:t>#   - tag 匹配统计 + 孤立 cpl 检测</w:t>
+        <w:br/>
+        <w:t>#   - 延迟统计（min/mean/median/p95/p99）</w:t>
+        <w:br/>
+        <w:t>#   - ASCII 直方图</w:t>
+        <w:br/>
+        <w:t>#   - DMA 总字节、MSI 向量分布</w:t>
+      </w:r>
+    </w:p>
+    <w:p>
+      <w:pPr>
+        <w:spacing w:before="160" w:after="120"/>
+      </w:pPr>
+      <w:r>
+        <w:rPr>
+          <w:b/>
+          <w:color w:val="2E75B6"/>
+          <w:sz w:val="30"/>
+          <w:rFonts w:ascii="Microsoft YaHei" w:hAnsi="Microsoft YaHei" w:eastAsia="Microsoft YaHei" w:cs="Microsoft YaHei"/>
+        </w:rPr>
+        <w:t>12.3 GDB 调试</w:t>
+      </w:r>
+    </w:p>
+    <w:p>
+      <w:pPr>
+        <w:spacing w:after="80"/>
+      </w:pPr>
+      <w:r>
+        <w:rPr>
+          <w:b w:val="0"/>
+          <w:i w:val="0"/>
+          <w:sz w:val="21"/>
+          <w:rFonts w:ascii="Microsoft YaHei" w:hAnsi="Microsoft YaHei" w:eastAsia="Microsoft YaHei" w:cs="Microsoft YaHei"/>
+        </w:rPr>
+        <w:t>完整指南：docs/GDB-Debugging-Guide.md</w:t>
+      </w:r>
+    </w:p>
+    <w:p>
+      <w:pPr>
+        <w:spacing w:before="40" w:after="120"/>
+        <w:ind w:left="227"/>
+        <w:shd w:val="clear" w:color="auto" w:fill="F2F2F2"/>
+      </w:pPr>
+      <w:r>
+        <w:rPr>
+          <w:rFonts w:ascii="Consolas" w:hAnsi="Consolas" w:eastAsia="Consolas" w:cs="Consolas"/>
+          <w:sz w:val="19"/>
+        </w:rPr>
+        <w:t># Guest 内核：</w:t>
+        <w:br/>
+        <w:t>GDB=1 ./scripts/run_cosim.sh        # QEMU 在 :1234 等待</w:t>
+        <w:br/>
+        <w:t>gdb vmlinux</w:t>
+        <w:br/>
+        <w:t>(gdb) target remote :1234</w:t>
+        <w:br/>
+        <w:br/>
+        <w:t># Bridge 库：</w:t>
+        <w:br/>
+        <w:t>gdb build/tests/integration/test_dma_roundtrip</w:t>
+        <w:br/>
+        <w:t>(gdb) break bridge_complete_dma</w:t>
+      </w:r>
+    </w:p>
+    <w:p>
+      <w:pPr>
+        <w:spacing w:before="160" w:after="120"/>
+      </w:pPr>
+      <w:r>
+        <w:rPr>
+          <w:b/>
+          <w:color w:val="2E75B6"/>
+          <w:sz w:val="30"/>
+          <w:rFonts w:ascii="Microsoft YaHei" w:hAnsi="Microsoft YaHei" w:eastAsia="Microsoft YaHei" w:cs="Microsoft YaHei"/>
+        </w:rPr>
+        <w:t>12.4 CI / actionlint</w:t>
+      </w:r>
+    </w:p>
+    <w:p>
+      <w:pPr>
+        <w:pStyle w:val="ListBullet"/>
+        <w:spacing w:after="40"/>
+      </w:pPr>
+      <w:r>
+        <w:rPr>
+          <w:sz w:val="21"/>
+          <w:rFonts w:ascii="Microsoft YaHei" w:hAnsi="Microsoft YaHei" w:eastAsia="Microsoft YaHei" w:cs="Microsoft YaHei"/>
+        </w:rPr>
+        <w:t>.github/workflows/ci.yml：每次 push/PR 自动 cmake build + ctest</w:t>
+      </w:r>
+    </w:p>
+    <w:p>
+      <w:pPr>
+        <w:pStyle w:val="ListBullet"/>
+        <w:spacing w:after="40"/>
+      </w:pPr>
+      <w:r>
+        <w:rPr>
+          <w:sz w:val="21"/>
+          <w:rFonts w:ascii="Microsoft YaHei" w:hAnsi="Microsoft YaHei" w:eastAsia="Microsoft YaHei" w:cs="Microsoft YaHei"/>
+        </w:rPr>
+        <w:t>Lint job：shellcheck + python compile 检查</w:t>
+      </w:r>
+    </w:p>
+    <w:p>
+      <w:pPr>
+        <w:pStyle w:val="ListBullet"/>
+        <w:spacing w:after="40"/>
+      </w:pPr>
+      <w:r>
+        <w:rPr>
+          <w:sz w:val="21"/>
+          <w:rFonts w:ascii="Microsoft YaHei" w:hAnsi="Microsoft YaHei" w:eastAsia="Microsoft YaHei" w:cs="Microsoft YaHei"/>
+        </w:rPr>
+        <w:t>本地校验：actionlint -no-color .github/workflows/ci.yml</w:t>
       </w:r>
     </w:p>
     <w:p>

</xml_diff>